<commit_message>
Cambiar el caso del instructivo B/L a exportación de flores
Co-Authored-By: Claude Opus 5.5 <noreply@anthropic.com>
Claude-Session: https://claude.ai/code/session_019dq69t5Yg5BciCkNwbVA4p
</commit_message>
<xml_diff>
--- a/logistica/Instructivo_BL_Moncada_Rangel_Medina.docx
+++ b/logistica/Instructivo_BL_Moncada_Rangel_Medina.docx
@@ -29,7 +29,7 @@
           <w:sz w:val="24"/>
           <w:szCs w:val="24"/>
         </w:rPr>
-        <w:t xml:space="preserve">Caso práctico: exportación de café colombiano a Estados Unidos</w:t>
+        <w:t xml:space="preserve">Caso práctico: exportación de flores colombianas a Estados Unidos</w:t>
       </w:r>
     </w:p>
     <w:p>
@@ -443,7 +443,7 @@
           <w:sz w:val="24"/>
           <w:szCs w:val="24"/>
         </w:rPr>
-        <w:t xml:space="preserve">En este instructivo explicamos qué es el B/L, qué va en cada casilla y de dónde sale cada dato. Para que sea más fácil de seguir, lo llenamos con un ejemplo: una empresa de Manizales que vende un contenedor de café verde a un importador de Houston. Al final, en el Anexo A, está el B/L completo con todos los datos del caso.</w:t>
+        <w:t xml:space="preserve">En este instructivo explicamos qué es el B/L, qué va en cada casilla y de dónde sale cada dato. Para que sea más fácil de seguir, lo llenamos con un ejemplo: una finca de flores de la Sabana de Bogotá que vende un contenedor refrigerado de rosas a un distribuidor de Miami. Al final, en el Anexo A, está el B/L completo con todos los datos del caso.</w:t>
       </w:r>
     </w:p>
     <w:p>
@@ -745,7 +745,21 @@
           <w:sz w:val="24"/>
           <w:szCs w:val="24"/>
         </w:rPr>
-        <w:t xml:space="preserve">Café Montaña Verde S.A.S. le vende 250 sacos de café verde a Blue Harbor Coffee Importers, en Houston. La venta se pactó en FOB Cartagena. Esto quiere decir que el exportador lleva el café hasta el buque en Cartagena y, en cuanto queda a bordo, el comprador paga el flete y asume el riesgo.</w:t>
+        <w:t xml:space="preserve">Flores La Sabana S.A.S. le vende 1.000 cajas de rosas a Sunshine Floral Distributors, en Miami. La venta se pactó en FOB Cartagena. Esto quiere decir que el exportador lleva las flores hasta el buque en Cartagena y, en cuanto quedan a bordo, el comprador paga el flete y asume el riesgo.</w:t>
+      </w:r>
+    </w:p>
+    <w:p>
+      <w:pPr>
+        <w:spacing w:after="200" w:before="0" w:line="360"/>
+        <w:jc w:val="both"/>
+      </w:pPr>
+      <w:r>
+        <w:rPr>
+          <w:rFonts w:ascii="Arial" w:cs="Arial" w:eastAsia="Arial" w:hAnsi="Arial"/>
+          <w:sz w:val="24"/>
+          <w:szCs w:val="24"/>
+        </w:rPr>
+        <w:t xml:space="preserve">La mayoría de las flores colombianas salen por avión, y en ese caso el documento sería una guía aérea (AWB), no un B/L. Para este trabajo escogimos un envío por barco en contenedor refrigerado, que también se usa porque sale más barato, aunque el viaje tarda más. Así podemos practicar con el B/L.</w:t>
       </w:r>
     </w:p>
     <w:p>
@@ -759,7 +773,7 @@
           <w:sz w:val="24"/>
           <w:szCs w:val="24"/>
         </w:rPr>
-        <w:t xml:space="preserve">El café sale de Manizales en camión hasta el puerto. Ese trayecto no aparece en el B/L, porque en FOB lo contrata y lo paga el exportador por su cuenta. La naviera solo recibe la carga en Cartagena.</w:t>
+        <w:t xml:space="preserve">Las flores salen de la finca en un camión refrigerado hasta el puerto. Ese trayecto no aparece en el B/L, porque en FOB lo contrata y lo paga el exportador por su cuenta. La naviera solo recibe la carga en Cartagena.</w:t>
       </w:r>
     </w:p>
     <w:p>
@@ -869,7 +883,7 @@
                 <w:sz w:val="20"/>
                 <w:szCs w:val="20"/>
               </w:rPr>
-              <w:t xml:space="preserve">Café Montaña Verde S.A.S., Manizales (Caldas)</w:t>
+              <w:t xml:space="preserve">Flores La Sabana S.A.S., Madrid (Cundinamarca)</w:t>
             </w:r>
           </w:p>
         </w:tc>
@@ -938,7 +952,7 @@
                 <w:sz w:val="20"/>
                 <w:szCs w:val="20"/>
               </w:rPr>
-              <w:t xml:space="preserve">Blue Harbor Coffee Importers Inc., Houston (Texas, EE. UU.)</w:t>
+              <w:t xml:space="preserve">Sunshine Floral Distributors Inc., Miami (Florida, EE. UU.)</w:t>
             </w:r>
           </w:p>
         </w:tc>
@@ -1007,7 +1021,7 @@
                 <w:sz w:val="20"/>
                 <w:szCs w:val="20"/>
               </w:rPr>
-              <w:t xml:space="preserve">Café verde excelso, 250 sacos de 70 kg (17.500 kg netos)</w:t>
+              <w:t xml:space="preserve">Rosas frescas cortadas, 1.000 cajas en 20 estibas</w:t>
             </w:r>
           </w:p>
         </w:tc>
@@ -1076,7 +1090,7 @@
                 <w:sz w:val="20"/>
                 <w:szCs w:val="20"/>
               </w:rPr>
-              <w:t xml:space="preserve">0901.11 (café sin tostar y sin descafeinar)</w:t>
+              <w:t xml:space="preserve">0603.11 (rosas frescas cortadas)</w:t>
             </w:r>
           </w:p>
         </w:tc>
@@ -1145,7 +1159,7 @@
                 <w:sz w:val="20"/>
                 <w:szCs w:val="20"/>
               </w:rPr>
-              <w:t xml:space="preserve">1 contenedor de 20 pies seco (20' DV), carga FCL</w:t>
+              <w:t xml:space="preserve">1 contenedor refrigerado de 40 pies (40' RH) a +1 °C, carga FCL</w:t>
             </w:r>
           </w:p>
         </w:tc>
@@ -1283,7 +1297,7 @@
                 <w:sz w:val="20"/>
                 <w:szCs w:val="20"/>
               </w:rPr>
-              <w:t xml:space="preserve">Cartagena (Colombia) a Houston (EE. UU.)</w:t>
+              <w:t xml:space="preserve">Cartagena (Colombia) a Miami (EE. UU.)</w:t>
             </w:r>
           </w:p>
         </w:tc>
@@ -1598,7 +1612,7 @@
                 <w:sz w:val="20"/>
                 <w:szCs w:val="20"/>
               </w:rPr>
-              <w:t xml:space="preserve">Qué se escribe (caso del café)</w:t>
+              <w:t xml:space="preserve">Qué se escribe (caso de las flores)</w:t>
             </w:r>
           </w:p>
         </w:tc>
@@ -1744,21 +1758,21 @@
                 <w:sz w:val="20"/>
                 <w:szCs w:val="20"/>
               </w:rPr>
-              <w:t xml:space="preserve">CAFÉ MONTAÑA VERDE S.A.S.</w:t>
-            </w:r>
-          </w:p>
-          <w:p>
-            <w:pPr>
-              <w:spacing w:after="0" w:line="240"/>
-              <w:jc w:val="left"/>
-            </w:pPr>
-            <w:r>
-              <w:rPr>
-                <w:rFonts w:ascii="Arial" w:cs="Arial" w:eastAsia="Arial" w:hAnsi="Arial"/>
-                <w:sz w:val="20"/>
-                <w:szCs w:val="20"/>
-              </w:rPr>
-              <w:t xml:space="preserve">CRA 23 No. 64-12, MANIZALES, CALDAS, COLOMBIA</w:t>
+              <w:t xml:space="preserve">FLORES LA SABANA S.A.S.</w:t>
+            </w:r>
+          </w:p>
+          <w:p>
+            <w:pPr>
+              <w:spacing w:after="0" w:line="240"/>
+              <w:jc w:val="left"/>
+            </w:pPr>
+            <w:r>
+              <w:rPr>
+                <w:rFonts w:ascii="Arial" w:cs="Arial" w:eastAsia="Arial" w:hAnsi="Arial"/>
+                <w:sz w:val="20"/>
+                <w:szCs w:val="20"/>
+              </w:rPr>
+              <w:t xml:space="preserve">KM 3 VÍA MADRID-FACATATIVÁ, MADRID, CUNDINAMARCA, COLOMBIA</w:t>
             </w:r>
           </w:p>
           <w:p>
@@ -1875,21 +1889,21 @@
                 <w:sz w:val="20"/>
                 <w:szCs w:val="20"/>
               </w:rPr>
-              <w:t xml:space="preserve">BLUE HARBOR COFFEE IMPORTERS INC.</w:t>
-            </w:r>
-          </w:p>
-          <w:p>
-            <w:pPr>
-              <w:spacing w:after="0" w:line="240"/>
-              <w:jc w:val="left"/>
-            </w:pPr>
-            <w:r>
-              <w:rPr>
-                <w:rFonts w:ascii="Arial" w:cs="Arial" w:eastAsia="Arial" w:hAnsi="Arial"/>
-                <w:sz w:val="20"/>
-                <w:szCs w:val="20"/>
-              </w:rPr>
-              <w:t xml:space="preserve">1250 COMMERCE ST, HOUSTON, TX 77002, USA</w:t>
+              <w:t xml:space="preserve">SUNSHINE FLORAL DISTRIBUTORS INC.</w:t>
+            </w:r>
+          </w:p>
+          <w:p>
+            <w:pPr>
+              <w:spacing w:after="0" w:line="240"/>
+              <w:jc w:val="left"/>
+            </w:pPr>
+            <w:r>
+              <w:rPr>
+                <w:rFonts w:ascii="Arial" w:cs="Arial" w:eastAsia="Arial" w:hAnsi="Arial"/>
+                <w:sz w:val="20"/>
+                <w:szCs w:val="20"/>
+              </w:rPr>
+              <w:t xml:space="preserve">7800 NW 25TH ST, MIAMI, FL 33122, USA</w:t>
             </w:r>
           </w:p>
         </w:tc>
@@ -1992,21 +2006,21 @@
                 <w:sz w:val="20"/>
                 <w:szCs w:val="20"/>
               </w:rPr>
-              <w:t xml:space="preserve">GULF COAST CUSTOMS BROKERS LLC</w:t>
-            </w:r>
-          </w:p>
-          <w:p>
-            <w:pPr>
-              <w:spacing w:after="0" w:line="240"/>
-              <w:jc w:val="left"/>
-            </w:pPr>
-            <w:r>
-              <w:rPr>
-                <w:rFonts w:ascii="Arial" w:cs="Arial" w:eastAsia="Arial" w:hAnsi="Arial"/>
-                <w:sz w:val="20"/>
-                <w:szCs w:val="20"/>
-              </w:rPr>
-              <w:t xml:space="preserve">HOUSTON, TX, USA</w:t>
+              <w:t xml:space="preserve">BISCAYNE CUSTOMS BROKERS LLC</w:t>
+            </w:r>
+          </w:p>
+          <w:p>
+            <w:pPr>
+              <w:spacing w:after="0" w:line="240"/>
+              <w:jc w:val="left"/>
+            </w:pPr>
+            <w:r>
+              <w:rPr>
+                <w:rFonts w:ascii="Arial" w:cs="Arial" w:eastAsia="Arial" w:hAnsi="Arial"/>
+                <w:sz w:val="20"/>
+                <w:szCs w:val="20"/>
+              </w:rPr>
+              <w:t xml:space="preserve">MIAMI, FL, USA</w:t>
             </w:r>
           </w:p>
         </w:tc>
@@ -2267,7 +2281,7 @@
                 <w:sz w:val="20"/>
                 <w:szCs w:val="20"/>
               </w:rPr>
-              <w:t xml:space="preserve">CRLN26CTG0457</w:t>
+              <w:t xml:space="preserve">CRLN26CTG0461</w:t>
             </w:r>
           </w:p>
         </w:tc>
@@ -2370,7 +2384,7 @@
                 <w:sz w:val="20"/>
                 <w:szCs w:val="20"/>
               </w:rPr>
-              <w:t xml:space="preserve">CTG2610457</w:t>
+              <w:t xml:space="preserve">CTG2610461</w:t>
             </w:r>
           </w:p>
         </w:tc>
@@ -2473,7 +2487,7 @@
                 <w:sz w:val="20"/>
                 <w:szCs w:val="20"/>
               </w:rPr>
-              <w:t xml:space="preserve">FACTURA FE-0158 / LOTE 26-118</w:t>
+              <w:t xml:space="preserve">FACTURA FE-0158 / PEDIDO SF-2611</w:t>
             </w:r>
           </w:p>
         </w:tc>
@@ -2649,7 +2663,7 @@
                 <w:sz w:val="20"/>
                 <w:szCs w:val="20"/>
               </w:rPr>
-              <w:t xml:space="preserve">Solo se llena si la naviera contrata el trayecto hasta el puerto. En FOB el camión de Manizales a Cartagena lo paga el exportador por su cuenta.</w:t>
+              <w:t xml:space="preserve">Solo se llena si la naviera contrata el trayecto hasta el puerto. En FOB el camión refrigerado de Madrid a Cartagena lo paga el exportador por su cuenta.</w:t>
             </w:r>
           </w:p>
         </w:tc>
@@ -3029,7 +3043,7 @@
                 <w:sz w:val="20"/>
                 <w:szCs w:val="20"/>
               </w:rPr>
-              <w:t xml:space="preserve">HOUSTON, TX, USA</w:t>
+              <w:t xml:space="preserve">MIAMI, FL, USA</w:t>
             </w:r>
           </w:p>
         </w:tc>
@@ -3132,7 +3146,7 @@
                 <w:sz w:val="20"/>
                 <w:szCs w:val="20"/>
               </w:rPr>
-              <w:t xml:space="preserve">HOUSTON, TX, USA</w:t>
+              <w:t xml:space="preserve">MIAMI, FL, USA</w:t>
             </w:r>
           </w:p>
         </w:tc>
@@ -3276,21 +3290,21 @@
                 <w:sz w:val="20"/>
                 <w:szCs w:val="20"/>
               </w:rPr>
-              <w:t xml:space="preserve">CRLU 204517-6 / SEAL CRL0457812</w:t>
-            </w:r>
-          </w:p>
-          <w:p>
-            <w:pPr>
-              <w:spacing w:after="0" w:line="240"/>
-              <w:jc w:val="left"/>
-            </w:pPr>
-            <w:r>
-              <w:rPr>
-                <w:rFonts w:ascii="Arial" w:cs="Arial" w:eastAsia="Arial" w:hAnsi="Arial"/>
-                <w:sz w:val="20"/>
-                <w:szCs w:val="20"/>
-              </w:rPr>
-              <w:t xml:space="preserve">MONTAÑA VERDE / CAFÉ DE COLOMBIA / LOTE 26-118 / HOUSTON</w:t>
+              <w:t xml:space="preserve">CRLU 587320-9 / SEAL CRL0461295</w:t>
+            </w:r>
+          </w:p>
+          <w:p>
+            <w:pPr>
+              <w:spacing w:after="0" w:line="240"/>
+              <w:jc w:val="left"/>
+            </w:pPr>
+            <w:r>
+              <w:rPr>
+                <w:rFonts w:ascii="Arial" w:cs="Arial" w:eastAsia="Arial" w:hAnsi="Arial"/>
+                <w:sz w:val="20"/>
+                <w:szCs w:val="20"/>
+              </w:rPr>
+              <w:t xml:space="preserve">LA SABANA / FRESH CUT ROSES / SF-2611 / MIAMI</w:t>
             </w:r>
           </w:p>
         </w:tc>
@@ -3393,7 +3407,7 @@
                 <w:sz w:val="20"/>
                 <w:szCs w:val="20"/>
               </w:rPr>
-              <w:t xml:space="preserve">250 BAGS</w:t>
+              <w:t xml:space="preserve">20 PALLETS S.T.C. 1,000 BOXES</w:t>
             </w:r>
           </w:p>
         </w:tc>
@@ -3425,7 +3439,7 @@
                 <w:sz w:val="20"/>
                 <w:szCs w:val="20"/>
               </w:rPr>
-              <w:t xml:space="preserve">Lista de empaque.</w:t>
+              <w:t xml:space="preserve">Lista de empaque. Se cuentan las estibas y entre paréntesis las cajas que llevan.</w:t>
             </w:r>
           </w:p>
         </w:tc>
@@ -3496,35 +3510,49 @@
                 <w:sz w:val="20"/>
                 <w:szCs w:val="20"/>
               </w:rPr>
-              <w:t xml:space="preserve">1 X 20' DV CONTAINER S.T.C.</w:t>
-            </w:r>
-          </w:p>
-          <w:p>
-            <w:pPr>
-              <w:spacing w:after="0" w:line="240"/>
-              <w:jc w:val="left"/>
-            </w:pPr>
-            <w:r>
-              <w:rPr>
-                <w:rFonts w:ascii="Arial" w:cs="Arial" w:eastAsia="Arial" w:hAnsi="Arial"/>
-                <w:sz w:val="20"/>
-                <w:szCs w:val="20"/>
-              </w:rPr>
-              <w:t xml:space="preserve">250 BAGS OF COLOMBIAN GREEN COFFEE, EXCELSO, 70 KG NET EACH</w:t>
-            </w:r>
-          </w:p>
-          <w:p>
-            <w:pPr>
-              <w:spacing w:after="0" w:line="240"/>
-              <w:jc w:val="left"/>
-            </w:pPr>
-            <w:r>
-              <w:rPr>
-                <w:rFonts w:ascii="Arial" w:cs="Arial" w:eastAsia="Arial" w:hAnsi="Arial"/>
-                <w:sz w:val="20"/>
-                <w:szCs w:val="20"/>
-              </w:rPr>
-              <w:t xml:space="preserve">HS CODE: 0901.11</w:t>
+              <w:t xml:space="preserve">1 X 40' RH REEFER CONTAINER S.T.C.</w:t>
+            </w:r>
+          </w:p>
+          <w:p>
+            <w:pPr>
+              <w:spacing w:after="0" w:line="240"/>
+              <w:jc w:val="left"/>
+            </w:pPr>
+            <w:r>
+              <w:rPr>
+                <w:rFonts w:ascii="Arial" w:cs="Arial" w:eastAsia="Arial" w:hAnsi="Arial"/>
+                <w:sz w:val="20"/>
+                <w:szCs w:val="20"/>
+              </w:rPr>
+              <w:t xml:space="preserve">20 PALLETS WITH 1,000 BOXES OF FRESH CUT ROSES</w:t>
+            </w:r>
+          </w:p>
+          <w:p>
+            <w:pPr>
+              <w:spacing w:after="0" w:line="240"/>
+              <w:jc w:val="left"/>
+            </w:pPr>
+            <w:r>
+              <w:rPr>
+                <w:rFonts w:ascii="Arial" w:cs="Arial" w:eastAsia="Arial" w:hAnsi="Arial"/>
+                <w:sz w:val="20"/>
+                <w:szCs w:val="20"/>
+              </w:rPr>
+              <w:t xml:space="preserve">HS CODE: 0603.11</w:t>
+            </w:r>
+          </w:p>
+          <w:p>
+            <w:pPr>
+              <w:spacing w:after="0" w:line="240"/>
+              <w:jc w:val="left"/>
+            </w:pPr>
+            <w:r>
+              <w:rPr>
+                <w:rFonts w:ascii="Arial" w:cs="Arial" w:eastAsia="Arial" w:hAnsi="Arial"/>
+                <w:sz w:val="20"/>
+                <w:szCs w:val="20"/>
+              </w:rPr>
+              <w:t xml:space="preserve">TEMPERATURE SET AT +1 °C</w:t>
             </w:r>
           </w:p>
           <w:p>
@@ -3570,7 +3598,7 @@
                 <w:sz w:val="20"/>
                 <w:szCs w:val="20"/>
               </w:rPr>
-              <w:t xml:space="preserve">Factura comercial. S.T.C. (said to contain) y SHIPPER'S LOAD, STOW AND COUNT indican que la naviera no vio lo que hay dentro porque el exportador llenó y selló el contenedor.</w:t>
+              <w:t xml:space="preserve">Factura comercial e instrucciones del exportador. En un contenedor refrigerado se escribe la temperatura pedida. S.T.C. (said to contain) y SHIPPER'S LOAD, STOW AND COUNT indican que la naviera no vio lo que hay dentro porque el exportador llenó y selló el contenedor.</w:t>
             </w:r>
           </w:p>
         </w:tc>
@@ -3641,7 +3669,7 @@
                 <w:sz w:val="20"/>
                 <w:szCs w:val="20"/>
               </w:rPr>
-              <w:t xml:space="preserve">17,675.00 KGS</w:t>
+              <w:t xml:space="preserve">11,800.00 KGS</w:t>
             </w:r>
           </w:p>
         </w:tc>
@@ -3673,7 +3701,7 @@
                 <w:sz w:val="20"/>
                 <w:szCs w:val="20"/>
               </w:rPr>
-              <w:t xml:space="preserve">Lista de empaque: 17.500 kg de café más el peso de los sacos. No incluye la tara del contenedor.</w:t>
+              <w:t xml:space="preserve">Lista de empaque: peso de las flores, las cajas y las estibas. No incluye la tara del contenedor.</w:t>
             </w:r>
           </w:p>
         </w:tc>
@@ -3744,7 +3772,7 @@
                 <w:sz w:val="20"/>
                 <w:szCs w:val="20"/>
               </w:rPr>
-              <w:t xml:space="preserve">27.50 CBM</w:t>
+              <w:t xml:space="preserve">58.00 CBM</w:t>
             </w:r>
           </w:p>
         </w:tc>
@@ -4529,7 +4557,7 @@
           <w:sz w:val="24"/>
           <w:szCs w:val="24"/>
         </w:rPr>
-        <w:t xml:space="preserve">Si el B/L dice 250 sacos y la factura dice 260, el banco puede rechazar los documentos o la aduana puede frenar la carga.</w:t>
+        <w:t xml:space="preserve">Si el B/L dice 1.000 cajas y la factura dice 1.100, el banco puede rechazar los documentos o la aduana puede frenar la carga.</w:t>
       </w:r>
     </w:p>
     <w:p>
@@ -4643,7 +4671,7 @@
           <w:sz w:val="24"/>
           <w:szCs w:val="24"/>
         </w:rPr>
-        <w:t xml:space="preserve">Escribir mal el número del contenedor. </w:t>
+        <w:t xml:space="preserve">No escribir la temperatura en un contenedor refrigerado. </w:t>
       </w:r>
       <w:r>
         <w:rPr>
@@ -4653,7 +4681,7 @@
           <w:sz w:val="24"/>
           <w:szCs w:val="24"/>
         </w:rPr>
-        <w:t xml:space="preserve">Un número con una letra o un dígito cambiado no corresponde al contenedor real y puede demorar el retiro en destino.</w:t>
+        <w:t xml:space="preserve">Si el B/L no dice a qué temperatura va la carga y las flores llegan dañadas, es más difícil reclamarle a la naviera.</w:t>
       </w:r>
     </w:p>
     <w:p>
@@ -4674,6 +4702,37 @@
           <w:sz w:val="24"/>
           <w:szCs w:val="24"/>
         </w:rPr>
+        <w:t xml:space="preserve">Escribir mal el número del contenedor. </w:t>
+      </w:r>
+      <w:r>
+        <w:rPr>
+          <w:rFonts w:ascii="Arial" w:cs="Arial" w:eastAsia="Arial" w:hAnsi="Arial"/>
+          <w:b w:val="false"/>
+          <w:bCs w:val="false"/>
+          <w:sz w:val="24"/>
+          <w:szCs w:val="24"/>
+        </w:rPr>
+        <w:t xml:space="preserve">Un número con una letra o un dígito cambiado no corresponde al contenedor real y puede demorar el retiro en destino.</w:t>
+      </w:r>
+    </w:p>
+    <w:p>
+      <w:pPr>
+        <w:pStyle w:val="ListParagraph"/>
+        <w:numPr>
+          <w:ilvl w:val="0"/>
+          <w:numId w:val="2"/>
+        </w:numPr>
+        <w:spacing w:after="120" w:line="360"/>
+        <w:jc w:val="both"/>
+      </w:pPr>
+      <w:r>
+        <w:rPr>
+          <w:rFonts w:ascii="Arial" w:cs="Arial" w:eastAsia="Arial" w:hAnsi="Arial"/>
+          <w:b/>
+          <w:bCs/>
+          <w:sz w:val="24"/>
+          <w:szCs w:val="24"/>
+        </w:rPr>
         <w:t xml:space="preserve">No controlar los originales. </w:t>
       </w:r>
       <w:r>
@@ -4715,7 +4774,7 @@
           <w:sz w:val="24"/>
           <w:szCs w:val="24"/>
         </w:rPr>
-        <w:t xml:space="preserve">Llenar el B/L con el caso del café nos mostró que casi ningún dato se inventa en el momento. Cada casilla sale de otro documento: la factura, la lista de empaque, la reserva o el contrato de compraventa. Si esos documentos están bien hechos, el B/L sale bien.</w:t>
+        <w:t xml:space="preserve">Llenar el B/L con el caso de las flores nos mostró que casi ningún dato se inventa en el momento. Cada casilla sale de otro documento: la factura, la lista de empaque, la reserva o el contrato de compraventa. Si esos documentos están bien hechos, el B/L sale bien.</w:t>
       </w:r>
     </w:p>
     <w:p>
@@ -4897,7 +4956,7 @@
                 <w:sz w:val="16"/>
                 <w:szCs w:val="16"/>
               </w:rPr>
-              <w:t xml:space="preserve">CAFÉ MONTAÑA VERDE S.A.S.</w:t>
+              <w:t xml:space="preserve">FLORES LA SABANA S.A.S.</w:t>
             </w:r>
           </w:p>
           <w:p>
@@ -4910,7 +4969,7 @@
                 <w:sz w:val="16"/>
                 <w:szCs w:val="16"/>
               </w:rPr>
-              <w:t xml:space="preserve">CRA 23 No. 64-12, MANIZALES</w:t>
+              <w:t xml:space="preserve">KM 3 VÍA MADRID-FACATATIVÁ</w:t>
             </w:r>
           </w:p>
           <w:p>
@@ -4923,7 +4982,7 @@
                 <w:sz w:val="16"/>
                 <w:szCs w:val="16"/>
               </w:rPr>
-              <w:t xml:space="preserve">CALDAS, COLOMBIA</w:t>
+              <w:t xml:space="preserve">MADRID, CUNDINAMARCA, COLOMBIA</w:t>
             </w:r>
           </w:p>
           <w:p>
@@ -5057,7 +5116,7 @@
                 <w:sz w:val="16"/>
                 <w:szCs w:val="16"/>
               </w:rPr>
-              <w:t xml:space="preserve">BLUE HARBOR COFFEE IMPORTERS INC.</w:t>
+              <w:t xml:space="preserve">SUNSHINE FLORAL DISTRIBUTORS INC.</w:t>
             </w:r>
           </w:p>
           <w:p>
@@ -5070,7 +5129,7 @@
                 <w:sz w:val="16"/>
                 <w:szCs w:val="16"/>
               </w:rPr>
-              <w:t xml:space="preserve">1250 COMMERCE ST, HOUSTON</w:t>
+              <w:t xml:space="preserve">7800 NW 25TH ST, MIAMI</w:t>
             </w:r>
           </w:p>
           <w:p>
@@ -5083,7 +5142,7 @@
                 <w:sz w:val="16"/>
                 <w:szCs w:val="16"/>
               </w:rPr>
-              <w:t xml:space="preserve">TX 77002, USA</w:t>
+              <w:t xml:space="preserve">FL 33122, USA</w:t>
             </w:r>
           </w:p>
         </w:tc>
@@ -5130,7 +5189,7 @@
                 <w:sz w:val="16"/>
                 <w:szCs w:val="16"/>
               </w:rPr>
-              <w:t xml:space="preserve">CRLN26CTG0457</w:t>
+              <w:t xml:space="preserve">CRLN26CTG0461</w:t>
             </w:r>
           </w:p>
         </w:tc>
@@ -5177,7 +5236,7 @@
                 <w:sz w:val="16"/>
                 <w:szCs w:val="16"/>
               </w:rPr>
-              <w:t xml:space="preserve">CTG2610457</w:t>
+              <w:t xml:space="preserve">CTG2610461</w:t>
             </w:r>
           </w:p>
         </w:tc>
@@ -5230,7 +5289,7 @@
                 <w:sz w:val="16"/>
                 <w:szCs w:val="16"/>
               </w:rPr>
-              <w:t xml:space="preserve">GULF COAST CUSTOMS BROKERS LLC</w:t>
+              <w:t xml:space="preserve">BISCAYNE CUSTOMS BROKERS LLC</w:t>
             </w:r>
           </w:p>
           <w:p>
@@ -5243,7 +5302,7 @@
                 <w:sz w:val="16"/>
                 <w:szCs w:val="16"/>
               </w:rPr>
-              <w:t xml:space="preserve">HOUSTON, TX, USA</w:t>
+              <w:t xml:space="preserve">MIAMI, FL, USA</w:t>
             </w:r>
           </w:p>
         </w:tc>
@@ -5303,7 +5362,7 @@
                 <w:sz w:val="16"/>
                 <w:szCs w:val="16"/>
               </w:rPr>
-              <w:t xml:space="preserve">LOTE 26-118</w:t>
+              <w:t xml:space="preserve">PEDIDO SF-2611</w:t>
             </w:r>
           </w:p>
         </w:tc>
@@ -5610,7 +5669,7 @@
                 <w:sz w:val="16"/>
                 <w:szCs w:val="16"/>
               </w:rPr>
-              <w:t xml:space="preserve">HOUSTON, TX, USA</w:t>
+              <w:t xml:space="preserve">MIAMI, FL, USA</w:t>
             </w:r>
           </w:p>
         </w:tc>
@@ -5657,7 +5716,7 @@
                 <w:sz w:val="16"/>
                 <w:szCs w:val="16"/>
               </w:rPr>
-              <w:t xml:space="preserve">HOUSTON, TX, USA</w:t>
+              <w:t xml:space="preserve">MIAMI, FL, USA</w:t>
             </w:r>
           </w:p>
         </w:tc>
@@ -5963,7 +6022,7 @@
                 <w:sz w:val="16"/>
                 <w:szCs w:val="16"/>
               </w:rPr>
-              <w:t xml:space="preserve">CRLU 204517-6</w:t>
+              <w:t xml:space="preserve">CRLU 587320-9</w:t>
             </w:r>
           </w:p>
           <w:p>
@@ -5976,7 +6035,7 @@
                 <w:sz w:val="16"/>
                 <w:szCs w:val="16"/>
               </w:rPr>
-              <w:t xml:space="preserve">SEAL CRL0457812</w:t>
+              <w:t xml:space="preserve">SEAL CRL0461295</w:t>
             </w:r>
           </w:p>
           <w:p>
@@ -6002,7 +6061,7 @@
                 <w:sz w:val="16"/>
                 <w:szCs w:val="16"/>
               </w:rPr>
-              <w:t xml:space="preserve">MONTAÑA VERDE</w:t>
+              <w:t xml:space="preserve">LA SABANA</w:t>
             </w:r>
           </w:p>
           <w:p>
@@ -6015,7 +6074,7 @@
                 <w:sz w:val="16"/>
                 <w:szCs w:val="16"/>
               </w:rPr>
-              <w:t xml:space="preserve">CAFÉ DE COLOMBIA</w:t>
+              <w:t xml:space="preserve">FRESH CUT ROSES</w:t>
             </w:r>
           </w:p>
           <w:p>
@@ -6028,7 +6087,7 @@
                 <w:sz w:val="16"/>
                 <w:szCs w:val="16"/>
               </w:rPr>
-              <w:t xml:space="preserve">LOTE 26-118</w:t>
+              <w:t xml:space="preserve">SF-2611</w:t>
             </w:r>
           </w:p>
           <w:p>
@@ -6041,7 +6100,7 @@
                 <w:sz w:val="16"/>
                 <w:szCs w:val="16"/>
               </w:rPr>
-              <w:t xml:space="preserve">HOUSTON</w:t>
+              <w:t xml:space="preserve">MIAMI</w:t>
             </w:r>
           </w:p>
         </w:tc>
@@ -6072,7 +6131,33 @@
                 <w:sz w:val="16"/>
                 <w:szCs w:val="16"/>
               </w:rPr>
-              <w:t xml:space="preserve">250 BAGS</w:t>
+              <w:t xml:space="preserve">20 PALLETS</w:t>
+            </w:r>
+          </w:p>
+          <w:p>
+            <w:pPr>
+              <w:spacing w:after="0" w:line="230"/>
+            </w:pPr>
+            <w:r>
+              <w:rPr>
+                <w:rFonts w:ascii="Courier New" w:cs="Courier New" w:eastAsia="Courier New" w:hAnsi="Courier New"/>
+                <w:sz w:val="16"/>
+                <w:szCs w:val="16"/>
+              </w:rPr>
+              <w:t xml:space="preserve">S.T.C.</w:t>
+            </w:r>
+          </w:p>
+          <w:p>
+            <w:pPr>
+              <w:spacing w:after="0" w:line="230"/>
+            </w:pPr>
+            <w:r>
+              <w:rPr>
+                <w:rFonts w:ascii="Courier New" w:cs="Courier New" w:eastAsia="Courier New" w:hAnsi="Courier New"/>
+                <w:sz w:val="16"/>
+                <w:szCs w:val="16"/>
+              </w:rPr>
+              <w:t xml:space="preserve">1,000 BOXES</w:t>
             </w:r>
           </w:p>
         </w:tc>
@@ -6103,7 +6188,7 @@
                 <w:sz w:val="16"/>
                 <w:szCs w:val="16"/>
               </w:rPr>
-              <w:t xml:space="preserve">1 X 20' DV CONTAINER S.T.C.</w:t>
+              <w:t xml:space="preserve">1 X 40' RH REEFER CONTAINER S.T.C.</w:t>
             </w:r>
           </w:p>
           <w:p>
@@ -6116,7 +6201,7 @@
                 <w:sz w:val="16"/>
                 <w:szCs w:val="16"/>
               </w:rPr>
-              <w:t xml:space="preserve">250 BAGS OF COLOMBIAN GREEN</w:t>
+              <w:t xml:space="preserve">20 PALLETS WITH 1,000 BOXES</w:t>
             </w:r>
           </w:p>
           <w:p>
@@ -6129,7 +6214,7 @@
                 <w:sz w:val="16"/>
                 <w:szCs w:val="16"/>
               </w:rPr>
-              <w:t xml:space="preserve">COFFEE, EXCELSO</w:t>
+              <w:t xml:space="preserve">OF FRESH CUT ROSES</w:t>
             </w:r>
           </w:p>
           <w:p>
@@ -6142,7 +6227,7 @@
                 <w:sz w:val="16"/>
                 <w:szCs w:val="16"/>
               </w:rPr>
-              <w:t xml:space="preserve">70 KG NET EACH</w:t>
+              <w:t xml:space="preserve">HS CODE: 0603.11</w:t>
             </w:r>
           </w:p>
           <w:p>
@@ -6155,7 +6240,7 @@
                 <w:sz w:val="16"/>
                 <w:szCs w:val="16"/>
               </w:rPr>
-              <w:t xml:space="preserve">HS CODE: 0901.11</w:t>
+              <w:t xml:space="preserve">TEMPERATURE SET AT +1 °C</w:t>
             </w:r>
           </w:p>
           <w:p>
@@ -6212,7 +6297,7 @@
                 <w:sz w:val="16"/>
                 <w:szCs w:val="16"/>
               </w:rPr>
-              <w:t xml:space="preserve">17,675.00</w:t>
+              <w:t xml:space="preserve">11,800.00</w:t>
             </w:r>
           </w:p>
           <w:p>
@@ -6256,7 +6341,7 @@
                 <w:sz w:val="16"/>
                 <w:szCs w:val="16"/>
               </w:rPr>
-              <w:t xml:space="preserve">27.50</w:t>
+              <w:t xml:space="preserve">58.00</w:t>
             </w:r>
           </w:p>
           <w:p>

</xml_diff>